<commit_message>
Re-render assembly diagrams at 4x resolution (3200px)
Used Swift/AppKit NSImage renderer instead of qlmanage for
sharp, zoomable images at 4x scale. Rebuilt docx with hi-res PNGs.

Co-Authored-By: Claude Opus 4.6 (1M context) <noreply@anthropic.com>
</commit_message>
<xml_diff>
--- a/build/LayIt_Laser_Illustrated_Assembly.docx
+++ b/build/LayIt_Laser_Illustrated_Assembly.docx
@@ -56,14 +56,14 @@
     </w:p>
     <w:p>
       <w:r>
-        <w:t>Before we start, here's how everything connects. Don't worry about understanding it all yet — we'll build it one piece at a time. But tape this page to the wall so you can always see where you're headed.</w:t>
+        <w:t>Before diving in, here's how everything connects. We'll build it one piece at a time.</w:t>
       </w:r>
     </w:p>
     <w:p>
       <w:r>
         <w:drawing>
           <wp:inline xmlns:a="http://schemas.openxmlformats.org/drawingml/2006/main" xmlns:pic="http://schemas.openxmlformats.org/drawingml/2006/picture">
-            <wp:extent cx="5943600" cy="5943600"/>
+            <wp:extent cx="5943600" cy="3714750"/>
             <wp:docPr id="1" name="Picture 1"/>
             <wp:cNvGraphicFramePr>
               <a:graphicFrameLocks noChangeAspect="1"/>
@@ -84,7 +84,7 @@
                   <pic:spPr>
                     <a:xfrm>
                       <a:off x="0" y="0"/>
-                      <a:ext cx="5943600" cy="5943600"/>
+                      <a:ext cx="5943600" cy="3714750"/>
                     </a:xfrm>
                     <a:prstGeom prst="rect"/>
                   </pic:spPr>
@@ -95,7 +95,6 @@
         </w:drawing>
       </w:r>
     </w:p>
-    <w:p/>
     <w:p>
       <w:r>
         <w:br w:type="page"/>
@@ -114,51 +113,10 @@
         <w:rPr>
           <w:b/>
         </w:rPr>
-        <w:t xml:space="preserve">What you're building: </w:t>
+        <w:t xml:space="preserve">Goal: </w:t>
       </w:r>
       <w:r>
-        <w:t>A power system that takes 12V from a USB-C charger and creates three voltage rails — 12V for the laser, 5V for the ESP32, and 3.3V for the DAC chip. Think of it like a house with three different electrical circuits.</w:t>
-      </w:r>
-    </w:p>
-    <w:p/>
-    <w:p>
-      <w:pPr>
-        <w:pStyle w:val="ListBullet"/>
-      </w:pPr>
-      <w:r>
-        <w:t>Parts for this step:</w:t>
-      </w:r>
-    </w:p>
-    <w:p>
-      <w:pPr>
-        <w:pStyle w:val="ListBullet"/>
-      </w:pPr>
-      <w:r>
-        <w:t>USB-C PD trigger board</w:t>
-      </w:r>
-    </w:p>
-    <w:p>
-      <w:pPr>
-        <w:pStyle w:val="ListBullet"/>
-      </w:pPr>
-      <w:r>
-        <w:t>2x AMS1117 voltage regulators (5V and 3.3V)</w:t>
-      </w:r>
-    </w:p>
-    <w:p>
-      <w:pPr>
-        <w:pStyle w:val="ListBullet"/>
-      </w:pPr>
-      <w:r>
-        <w:t>3x 100nF capacitors (tiny yellow or blue rectangles)</w:t>
-      </w:r>
-    </w:p>
-    <w:p>
-      <w:pPr>
-        <w:pStyle w:val="ListBullet"/>
-      </w:pPr>
-      <w:r>
-        <w:t>RED, BLACK, ORANGE, and YELLOW hookup wire</w:t>
+        <w:t>Get 12V from USB-C, split into 12V, 5V, and 3.3V rails. Like a house with 3 electrical circuits.</w:t>
       </w:r>
     </w:p>
     <w:p/>
@@ -166,7 +124,7 @@
       <w:r>
         <w:drawing>
           <wp:inline xmlns:a="http://schemas.openxmlformats.org/drawingml/2006/main" xmlns:pic="http://schemas.openxmlformats.org/drawingml/2006/picture">
-            <wp:extent cx="5943600" cy="5943600"/>
+            <wp:extent cx="5943600" cy="3714750"/>
             <wp:docPr id="2" name="Picture 2"/>
             <wp:cNvGraphicFramePr>
               <a:graphicFrameLocks noChangeAspect="1"/>
@@ -187,7 +145,7 @@
                   <pic:spPr>
                     <a:xfrm>
                       <a:off x="0" y="0"/>
-                      <a:ext cx="5943600" cy="5943600"/>
+                      <a:ext cx="5943600" cy="3714750"/>
                     </a:xfrm>
                     <a:prstGeom prst="rect"/>
                   </pic:spPr>
@@ -204,10 +162,10 @@
         <w:rPr>
           <w:b/>
         </w:rPr>
-        <w:t xml:space="preserve">Key concept — Voltage regulators: </w:t>
+        <w:t xml:space="preserve">Voltage regulators </w:t>
       </w:r>
       <w:r>
-        <w:t>They're like water pressure reducers. 12V comes in, but the ESP32 only wants 5V and the DAC only wants 3.3V. Too much voltage would fry them. The regulators step it down safely.</w:t>
+        <w:t>are like water pressure reducers. 12V comes in, the regulator steps it down to 5V or 3.3V so it doesn't fry the ESP32 or DAC.</w:t>
       </w:r>
     </w:p>
     <w:p>
@@ -228,43 +186,10 @@
         <w:rPr>
           <w:b/>
         </w:rPr>
-        <w:t xml:space="preserve">What you're building: </w:t>
+        <w:t xml:space="preserve">Goal: </w:t>
       </w:r>
       <w:r>
-        <w:t>Connecting the ESP32 microcontroller — the brain that receives tile coordinates from your phone via WiFi and controls everything else. This is the green circuit board with the metal shield on it.</w:t>
-      </w:r>
-    </w:p>
-    <w:p/>
-    <w:p>
-      <w:pPr>
-        <w:pStyle w:val="ListBullet"/>
-      </w:pPr>
-      <w:r>
-        <w:t>Parts for this step:</w:t>
-      </w:r>
-    </w:p>
-    <w:p>
-      <w:pPr>
-        <w:pStyle w:val="ListBullet"/>
-      </w:pPr>
-      <w:r>
-        <w:t>ESP32-S3-WROOM-1 dev board (should have pin headers already soldered)</w:t>
-      </w:r>
-    </w:p>
-    <w:p>
-      <w:pPr>
-        <w:pStyle w:val="ListBullet"/>
-      </w:pPr>
-      <w:r>
-        <w:t>ORANGE wire (5V from Step 1)</w:t>
-      </w:r>
-    </w:p>
-    <w:p>
-      <w:pPr>
-        <w:pStyle w:val="ListBullet"/>
-      </w:pPr>
-      <w:r>
-        <w:t>BLACK wire (ground from Step 1)</w:t>
+        <w:t>Power up the ESP32 — the green circuit board that receives tile coordinates from your phone via WiFi and controls everything else.</w:t>
       </w:r>
     </w:p>
     <w:p/>
@@ -272,7 +197,7 @@
       <w:r>
         <w:drawing>
           <wp:inline xmlns:a="http://schemas.openxmlformats.org/drawingml/2006/main" xmlns:pic="http://schemas.openxmlformats.org/drawingml/2006/picture">
-            <wp:extent cx="5943600" cy="5943600"/>
+            <wp:extent cx="5943600" cy="3343275"/>
             <wp:docPr id="3" name="Picture 3"/>
             <wp:cNvGraphicFramePr>
               <a:graphicFrameLocks noChangeAspect="1"/>
@@ -293,7 +218,7 @@
                   <pic:spPr>
                     <a:xfrm>
                       <a:off x="0" y="0"/>
-                      <a:ext cx="5943600" cy="5943600"/>
+                      <a:ext cx="5943600" cy="3343275"/>
                     </a:xfrm>
                     <a:prstGeom prst="rect"/>
                   </pic:spPr>
@@ -310,10 +235,10 @@
         <w:rPr>
           <w:b/>
         </w:rPr>
-        <w:t xml:space="preserve">Key concept — GPIO pins: </w:t>
+        <w:t xml:space="preserve">GPIO pins </w:t>
       </w:r>
       <w:r>
-        <w:t>GPIO stands for General Purpose Input/Output. They're the numbered pins on the ESP32 that you can program to send signals. GPIO 4 will control the laser on/off. GPIOs 5, 18, and 23 will talk to the DAC chip.</w:t>
+        <w:t>are the numbered pins you program to send signals. GPIO 4 = laser on/off. GPIOs 5, 18, 23 = talk to the DAC chip.</w:t>
       </w:r>
     </w:p>
     <w:p>
@@ -334,10 +259,10 @@
         <w:rPr>
           <w:b/>
         </w:rPr>
-        <w:t xml:space="preserve">What you're building: </w:t>
+        <w:t xml:space="preserve">Goal: </w:t>
       </w:r>
       <w:r>
-        <w:t>The circuit that translates digital numbers from the ESP32 into analog voltages that physically move the galvo mirrors. Two chips: the MCP4822 (translator) and the TL072 (amplifier). Both are small black rectangles with 8 metal legs — they look like tiny beetles.</w:t>
+        <w:t>Convert digital numbers from the ESP32 into analog voltages that physically move the galvo mirrors. Two tiny black chips with 8 legs each.</w:t>
       </w:r>
     </w:p>
     <w:p/>
@@ -347,10 +272,10 @@
           <w:b/>
           <w:color w:val="EF4444"/>
         </w:rPr>
-        <w:t xml:space="preserve">⚠️ Pin 1 marker: </w:t>
+        <w:t xml:space="preserve">⚠️ Find the pin 1 DOT on each chip before inserting! </w:t>
       </w:r>
       <w:r>
-        <w:t>Both chips have a DOT or NOTCH near pin 1. This tells you which way to orient the chip. If you put it in backwards, it won't work (and could fry). Always find the dot first.</w:t>
+        <w:t>Backwards = fried chip.</w:t>
       </w:r>
     </w:p>
     <w:p/>
@@ -358,7 +283,7 @@
       <w:r>
         <w:drawing>
           <wp:inline xmlns:a="http://schemas.openxmlformats.org/drawingml/2006/main" xmlns:pic="http://schemas.openxmlformats.org/drawingml/2006/picture">
-            <wp:extent cx="5943600" cy="5943600"/>
+            <wp:extent cx="5943600" cy="4086225"/>
             <wp:docPr id="4" name="Picture 4"/>
             <wp:cNvGraphicFramePr>
               <a:graphicFrameLocks noChangeAspect="1"/>
@@ -379,7 +304,7 @@
                   <pic:spPr>
                     <a:xfrm>
                       <a:off x="0" y="0"/>
-                      <a:ext cx="5943600" cy="5943600"/>
+                      <a:ext cx="5943600" cy="4086225"/>
                     </a:xfrm>
                     <a:prstGeom prst="rect"/>
                   </pic:spPr>
@@ -388,18 +313,6 @@
             </a:graphic>
           </wp:inline>
         </w:drawing>
-      </w:r>
-    </w:p>
-    <w:p/>
-    <w:p>
-      <w:r>
-        <w:rPr>
-          <w:b/>
-        </w:rPr>
-        <w:t xml:space="preserve">Key concept — SPI bus: </w:t>
-      </w:r>
-      <w:r>
-        <w:t>SPI is how the ESP32 talks to the DAC. Three wires: BLUE (data), WHITE (clock), PURPLE (chip select). Think of it like a conversation — the clock says 'ready?', the data says the number, and chip select says 'I'm talking to you.'</w:t>
       </w:r>
     </w:p>
     <w:p>
@@ -420,10 +333,10 @@
         <w:rPr>
           <w:b/>
         </w:rPr>
-        <w:t xml:space="preserve">What you're building: </w:t>
+        <w:t xml:space="preserve">Goal: </w:t>
       </w:r>
       <w:r>
-        <w:t>Connecting the laser module. It's a metal cylinder about the size of your thumb with a lens on one end and three wires on the other. RED for 12V power, BLACK for ground, and a TTL control wire that the ESP32 uses to turn it on and off thousands of times per second.</w:t>
+        <w:t>Wire the laser module — a metal cylinder the size of your thumb. Three wires: RED (12V power), BLACK (ground), GREEN (ESP32 on/off control).</w:t>
       </w:r>
     </w:p>
     <w:p/>
@@ -433,10 +346,7 @@
           <w:b/>
           <w:color w:val="EF4444"/>
         </w:rPr>
-        <w:t xml:space="preserve">⚠️ LASER SAFETY: </w:t>
-      </w:r>
-      <w:r>
-        <w:t>200mW is powerful enough to cause eye damage instantly. ALWAYS: (1) wear OD4+ safety goggles for 520nm, (2) tape the laser module to the table pointing at a wall before powering on, (3) never look into the beam, (4) keep pets and kids out of the room during testing.</w:t>
+        <w:t>⚠️ LASER SAFETY: 200mW causes instant eye damage. Goggles ON. Tape laser to table pointing at wall. Never look into beam.</w:t>
       </w:r>
     </w:p>
     <w:p/>
@@ -444,7 +354,7 @@
       <w:r>
         <w:drawing>
           <wp:inline xmlns:a="http://schemas.openxmlformats.org/drawingml/2006/main" xmlns:pic="http://schemas.openxmlformats.org/drawingml/2006/picture">
-            <wp:extent cx="5943600" cy="5943600"/>
+            <wp:extent cx="5943600" cy="2971800"/>
             <wp:docPr id="5" name="Picture 5"/>
             <wp:cNvGraphicFramePr>
               <a:graphicFrameLocks noChangeAspect="1"/>
@@ -465,7 +375,7 @@
                   <pic:spPr>
                     <a:xfrm>
                       <a:off x="0" y="0"/>
-                      <a:ext cx="5943600" cy="5943600"/>
+                      <a:ext cx="5943600" cy="2971800"/>
                     </a:xfrm>
                     <a:prstGeom prst="rect"/>
                   </pic:spPr>
@@ -486,27 +396,12 @@
         <w:pStyle w:val="Heading1"/>
       </w:pPr>
       <w:r>
-        <w:t>Step 5: Galvo Scanners (The Mirrors)</w:t>
+        <w:t>Step 5: Mount Galvo Scanners</w:t>
       </w:r>
     </w:p>
     <w:p>
       <w:r>
-        <w:rPr>
-          <w:b/>
-        </w:rPr>
-        <w:t xml:space="preserve">What you're building: </w:t>
-      </w:r>
-      <w:r>
-        <w:t>Mounting the galvanometer scanners — two small motors with mirrors attached. One tilts the mirror left/right (X axis), the other tilts up/down (Y axis). Together they steer the laser beam to draw patterns on the wall. They come as a set with driver boards.</w:t>
-      </w:r>
-    </w:p>
-    <w:p/>
-    <w:p>
-      <w:r>
-        <w:rPr>
-          <w:b/>
-        </w:rPr>
-        <w:t xml:space="preserve">Galvo connections: </w:t>
+        <w:t>Two small motors with mirrors. One steers left/right (X), one steers up/down (Y). Together they draw patterns.</w:t>
       </w:r>
     </w:p>
     <w:p>
@@ -514,7 +409,7 @@
         <w:pStyle w:val="ListBullet"/>
       </w:pPr>
       <w:r>
-        <w:t>BROWN wire (from TL072 output A) → X driver "signal in"</w:t>
+        <w:t>BROWN wire (from op-amp output A) → X driver signal input</w:t>
       </w:r>
     </w:p>
     <w:p>
@@ -522,7 +417,7 @@
         <w:pStyle w:val="ListBullet"/>
       </w:pPr>
       <w:r>
-        <w:t>GRAY wire (from TL072 output B) → Y driver "signal in"</w:t>
+        <w:t>GRAY wire (from op-amp output B) → Y driver signal input</w:t>
       </w:r>
     </w:p>
     <w:p>
@@ -530,34 +425,15 @@
         <w:pStyle w:val="ListBullet"/>
       </w:pPr>
       <w:r>
-        <w:t>RED wire (12V) → each driver board V+</w:t>
-      </w:r>
-    </w:p>
-    <w:p>
-      <w:pPr>
-        <w:pStyle w:val="ListBullet"/>
-      </w:pPr>
-      <w:r>
-        <w:t>BLACK wire (GND) → each driver board GND</w:t>
-      </w:r>
-    </w:p>
-    <w:p/>
-    <w:p>
-      <w:r>
-        <w:rPr>
-          <w:b/>
-        </w:rPr>
-        <w:t xml:space="preserve">Mirror alignment: </w:t>
-      </w:r>
-      <w:r>
-        <w:t>The laser beam hits mirror 1 (X), bounces to mirror 2 (Y), then exits the enclosure. Adjust the mirror angles so the beam exits cleanly through a hole in the case. This is fiddly — expect 10-15 minutes of nudging. The galvo set's instructions show the correct geometry.</w:t>
+        <w:t>RED (12V) + BLACK (GND) → each driver board power</w:t>
       </w:r>
     </w:p>
     <w:p>
       <w:r>
-        <w:br w:type="page"/>
+        <w:t>Align mirrors so laser beam bounces: laser → mirror 1 → mirror 2 → out the hole in the case. Takes 10-15 min of nudging.</w:t>
       </w:r>
     </w:p>
+    <w:p/>
     <w:p>
       <w:pPr>
         <w:pStyle w:val="Heading1"/>
@@ -568,67 +444,7 @@
     </w:p>
     <w:p>
       <w:r>
-        <w:rPr>
-          <w:b/>
-          <w:sz w:val="28"/>
-        </w:rPr>
-        <w:t xml:space="preserve">The moment of truth. </w:t>
-      </w:r>
-    </w:p>
-    <w:p/>
-    <w:p>
-      <w:r>
-        <w:rPr>
-          <w:b/>
-        </w:rPr>
-        <w:t xml:space="preserve">Download Arduino IDE — </w:t>
-      </w:r>
-      <w:r>
-        <w:t>Free from arduino.cc. Install it. Go to Tools → Board Manager → search "esp32" → install the ESP32 package.</w:t>
-      </w:r>
-    </w:p>
-    <w:p>
-      <w:r>
-        <w:rPr>
-          <w:b/>
-        </w:rPr>
-        <w:t xml:space="preserve">Open the test firmware — </w:t>
-      </w:r>
-      <w:r>
-        <w:t>I'll provide a .ino file that draws a simple green square on the wall. Open it in Arduino IDE.</w:t>
-      </w:r>
-    </w:p>
-    <w:p>
-      <w:r>
-        <w:rPr>
-          <w:b/>
-        </w:rPr>
-        <w:t xml:space="preserve">Select your board — </w:t>
-      </w:r>
-      <w:r>
-        <w:t>Tools → Board → ESP32S3 Dev Module. Tools → Port → (whatever shows up when you plug in the ESP32 USB).</w:t>
-      </w:r>
-    </w:p>
-    <w:p>
-      <w:r>
-        <w:rPr>
-          <w:b/>
-        </w:rPr>
-        <w:t xml:space="preserve">Upload — </w:t>
-      </w:r>
-      <w:r>
-        <w:t>Click the → arrow button. Wait 30 seconds. It should say "Done uploading."</w:t>
-      </w:r>
-    </w:p>
-    <w:p>
-      <w:r>
-        <w:rPr>
-          <w:b/>
-        </w:rPr>
-        <w:t xml:space="preserve">GOGGLES ON. Power on. — </w:t>
-      </w:r>
-      <w:r>
-        <w:t>The laser should draw a green square on the wall. If you see a square — you built a laser projector.</w:t>
+        <w:t>Install Arduino IDE (free). Open the test firmware .ino file I'll write for you. Select ESP32S3 Dev Module. Click Upload. Put on goggles. Power on.</w:t>
       </w:r>
     </w:p>
     <w:p/>
@@ -637,7 +453,7 @@
         <w:pStyle w:val="Heading3"/>
       </w:pPr>
       <w:r>
-        <w:t>What to expect:</w:t>
+        <w:t>What you should see:</w:t>
       </w:r>
     </w:p>
     <w:p>
@@ -645,10 +461,10 @@
         <w:rPr>
           <w:b/>
         </w:rPr>
-        <w:t xml:space="preserve">"Green square on wall" → </w:t>
+        <w:t xml:space="preserve">"Green SQUARE on wall" → </w:t>
       </w:r>
       <w:r>
-        <w:t>🎉 SUCCESS! Everything works. You built it.</w:t>
+        <w:t>🎉 You built a laser projector!</w:t>
       </w:r>
     </w:p>
     <w:p>
@@ -656,10 +472,10 @@
         <w:rPr>
           <w:b/>
         </w:rPr>
-        <w:t xml:space="preserve">"Green LINE (not square)" → </w:t>
+        <w:t xml:space="preserve">"Green LINE" → </w:t>
       </w:r>
       <w:r>
-        <w:t>One galvo axis works, the other doesn't. Check the non-working axis: BROWN or GRAY wire.</w:t>
+        <w:t>One galvo axis dead — check BROWN or GRAY wire</w:t>
       </w:r>
     </w:p>
     <w:p>
@@ -667,10 +483,10 @@
         <w:rPr>
           <w:b/>
         </w:rPr>
-        <w:t xml:space="preserve">"Green DOT (not moving)" → </w:t>
+        <w:t xml:space="preserve">"Green DOT" → </w:t>
       </w:r>
       <w:r>
-        <w:t>Neither galvo responding. Check DAC wiring (SPI: BLUE, WHITE, PURPLE).</w:t>
+        <w:t>Neither galvo responding — check DAC wiring</w:t>
       </w:r>
     </w:p>
     <w:p>
@@ -678,13 +494,12 @@
         <w:rPr>
           <w:b/>
         </w:rPr>
-        <w:t xml:space="preserve">"Nothing at all" → </w:t>
+        <w:t xml:space="preserve">"Nothing" → </w:t>
       </w:r>
       <w:r>
-        <w:t>Check power. Check firmware upload succeeded. Try ESP32's own USB.</w:t>
+        <w:t>Check power, check firmware upload, try ESP32 USB</w:t>
       </w:r>
     </w:p>
-    <w:p/>
     <w:p/>
     <w:p>
       <w:pPr>
@@ -692,14 +507,13 @@
       </w:pPr>
       <w:r>
         <w:rPr>
-          <w:b/>
           <w:i/>
           <w:color w:val="22C55E"/>
-          <w:sz w:val="28"/>
         </w:rPr>
-        <w:t>Congratulations. You just built a laser projector.</w:t>
         <w:br/>
         <w:t>Every tile in its perfect place.</w:t>
+        <w:br/>
+        <w:t>SIMCO Inc. • Patent Pending</w:t>
       </w:r>
     </w:p>
     <w:sectPr>

</xml_diff>